<commit_message>
v443.1.1: Gliederungsabstände der BWA-Unterlagen absichern
</commit_message>
<xml_diff>
--- a/testakten/steuerrecht-bwa-vergleich-nuernberg/01_Unternehmensangaben_2026-01-15.docx
+++ b/testakten/steuerrecht-bwa-vergleich-nuernberg/01_Unternehmensangaben_2026-01-15.docx
@@ -59,10 +59,22 @@
     <w:p>
       <w:pPr>
         <w:pStyle w:val="Heading1"/>
-        <w:spacing w:after="140" w:line="259" w:lineRule="auto"/>
+        <w:keepNext/>
+        <w:spacing w:after="0" w:line="259" w:lineRule="auto"/>
       </w:pPr>
       <w:r>
         <w:t>1 Betrieb und Zuständigkeiten</w:t>
+      </w:r>
+    </w:p>
+    <w:p>
+      <w:pPr>
+        <w:keepNext/>
+        <w:spacing w:before="0" w:after="0" w:line="220" w:lineRule="exact"/>
+      </w:pPr>
+      <w:r>
+        <w:rPr>
+          <w:sz w:val="22"/>
+        </w:rPr>
       </w:r>
     </w:p>
     <w:p>
@@ -92,10 +104,22 @@
     <w:p>
       <w:pPr>
         <w:pStyle w:val="Heading1"/>
-        <w:spacing w:after="140" w:line="259" w:lineRule="auto"/>
+        <w:keepNext/>
+        <w:spacing w:after="0" w:line="259" w:lineRule="auto"/>
       </w:pPr>
       <w:r>
         <w:t>2 Waren und Absatz</w:t>
+      </w:r>
+    </w:p>
+    <w:p>
+      <w:pPr>
+        <w:keepNext/>
+        <w:spacing w:before="0" w:after="0" w:line="220" w:lineRule="exact"/>
+      </w:pPr>
+      <w:r>
+        <w:rPr>
+          <w:sz w:val="22"/>
+        </w:rPr>
       </w:r>
     </w:p>
     <w:p>
@@ -117,10 +141,22 @@
     <w:p>
       <w:pPr>
         <w:pStyle w:val="Heading1"/>
-        <w:spacing w:after="140" w:line="259" w:lineRule="auto"/>
+        <w:keepNext/>
+        <w:spacing w:after="0" w:line="259" w:lineRule="auto"/>
       </w:pPr>
       <w:r>
         <w:t>3 Rechnungswesen und Stichtag</w:t>
+      </w:r>
+    </w:p>
+    <w:p>
+      <w:pPr>
+        <w:keepNext/>
+        <w:spacing w:before="0" w:after="0" w:line="220" w:lineRule="exact"/>
+      </w:pPr>
+      <w:r>
+        <w:rPr>
+          <w:sz w:val="22"/>
+        </w:rPr>
       </w:r>
     </w:p>
     <w:p>
@@ -150,10 +186,22 @@
     <w:p>
       <w:pPr>
         <w:pStyle w:val="Heading1"/>
-        <w:spacing w:after="140" w:line="259" w:lineRule="auto"/>
+        <w:keepNext/>
+        <w:spacing w:after="0" w:line="259" w:lineRule="auto"/>
       </w:pPr>
       <w:r>
         <w:t>4 Ansprechpartner</w:t>
+      </w:r>
+    </w:p>
+    <w:p>
+      <w:pPr>
+        <w:keepNext/>
+        <w:spacing w:before="0" w:after="0" w:line="220" w:lineRule="exact"/>
+      </w:pPr>
+      <w:r>
+        <w:rPr>
+          <w:sz w:val="22"/>
+        </w:rPr>
       </w:r>
     </w:p>
     <w:p>

</xml_diff>